<commit_message>
docs: regenerate guide docx for v21
</commit_message>
<xml_diff>
--- a/河谷疗养院案·完整攻略.new.docx
+++ b/河谷疗养院案·完整攻略.new.docx
@@ -15,7 +15,7 @@
         <w:ind w:left="360"/>
       </w:pPr>
       <w:r>
-        <w:t>适用版本：story.json v15（含修复室=几居 / 濯枝名取自 Z-007 登记条）</w:t>
+        <w:t>适用版本：story.json v21（含修复室=几居 / 濯枝名取自 Z-007 登记条 / 聊天包含式匹配）</w:t>
       </w:r>
     </w:p>
     <w:p>
@@ -97,6 +97,34 @@
       </w:r>
       <w:r>
         <w:t>：最终章指认谁就直接进对应结局，指认前请先确认线索收集度。</w:t>
+      </w:r>
+    </w:p>
+    <w:p>
+      <w:pPr>
+        <w:pStyle w:val="ListBullet"/>
+      </w:pPr>
+      <w:r>
+        <w:rPr>
+          <w:b/>
+        </w:rPr>
+        <w:t>聊天问法随意</w:t>
+      </w:r>
+      <w:r>
+        <w:t>：罗伦萨频道已支持模糊匹配——输入里包含词条名/别名（或反过来）即触发，例如「现场情况如何」「鞋印」都能命中。</w:t>
+      </w:r>
+    </w:p>
+    <w:p>
+      <w:pPr>
+        <w:pStyle w:val="ListBullet"/>
+      </w:pPr>
+      <w:r>
+        <w:rPr>
+          <w:b/>
+        </w:rPr>
+        <w:t>存档与全解锁</w:t>
+      </w:r>
+      <w:r>
+        <w:t>：右侧边栏有「💾 存档导出 / 导入」（save.html）和「🔓 全解锁存档」（unlock.html）两个工具页。</w:t>
       </w:r>
     </w:p>
     <w:p>
@@ -2515,7 +2543,7 @@
           </w:tcPr>
           <w:p>
             <w:r>
-              <w:t>她成了她要守护的名字</w:t>
+              <w:t>她遗失的过往：特因的来历</w:t>
             </w:r>
           </w:p>
         </w:tc>
@@ -3662,7 +3690,137 @@
         <w:pStyle w:val="Heading2"/>
       </w:pPr>
       <w:r>
-        <w:t>六、卡点排错</w:t>
+        <w:t>六、实用工具页</w:t>
+      </w:r>
+    </w:p>
+    <w:tbl>
+      <w:tblPr>
+        <w:tblStyle w:val="TableGrid"/>
+        <w:tblW w:type="auto" w:w="0"/>
+        <w:tblLook w:firstColumn="1" w:firstRow="1" w:lastColumn="0" w:lastRow="0" w:noHBand="0" w:noVBand="1" w:val="04A0"/>
+      </w:tblPr>
+      <w:tblGrid>
+        <w:gridCol w:w="2880"/>
+        <w:gridCol w:w="2880"/>
+        <w:gridCol w:w="2880"/>
+      </w:tblGrid>
+      <w:tr>
+        <w:tc>
+          <w:tcPr>
+            <w:tcW w:type="dxa" w:w="2880"/>
+          </w:tcPr>
+          <w:p>
+            <w:r>
+              <w:rPr>
+                <w:b/>
+              </w:rPr>
+              <w:t>页面</w:t>
+            </w:r>
+          </w:p>
+        </w:tc>
+        <w:tc>
+          <w:tcPr>
+            <w:tcW w:type="dxa" w:w="2880"/>
+          </w:tcPr>
+          <w:p>
+            <w:r>
+              <w:rPr>
+                <w:b/>
+              </w:rPr>
+              <w:t>地址（相对根目录）</w:t>
+            </w:r>
+          </w:p>
+        </w:tc>
+        <w:tc>
+          <w:tcPr>
+            <w:tcW w:type="dxa" w:w="2880"/>
+          </w:tcPr>
+          <w:p>
+            <w:r>
+              <w:rPr>
+                <w:b/>
+              </w:rPr>
+              <w:t>功能</w:t>
+            </w:r>
+          </w:p>
+        </w:tc>
+      </w:tr>
+      <w:tr>
+        <w:tc>
+          <w:tcPr>
+            <w:tcW w:type="dxa" w:w="2880"/>
+          </w:tcPr>
+          <w:p>
+            <w:r>
+              <w:t>存档管理</w:t>
+            </w:r>
+          </w:p>
+        </w:tc>
+        <w:tc>
+          <w:tcPr>
+            <w:tcW w:type="dxa" w:w="2880"/>
+          </w:tcPr>
+          <w:p>
+            <w:r>
+              <w:t>/save.html</w:t>
+            </w:r>
+          </w:p>
+        </w:tc>
+        <w:tc>
+          <w:tcPr>
+            <w:tcW w:type="dxa" w:w="2880"/>
+          </w:tcPr>
+          <w:p>
+            <w:r>
+              <w:t>导出当前进度为 JSON 文件；导入存档覆盖（导入前会预览线索数/进度）</w:t>
+            </w:r>
+          </w:p>
+        </w:tc>
+      </w:tr>
+      <w:tr>
+        <w:tc>
+          <w:tcPr>
+            <w:tcW w:type="dxa" w:w="2880"/>
+          </w:tcPr>
+          <w:p>
+            <w:r>
+              <w:t>全解锁</w:t>
+            </w:r>
+          </w:p>
+        </w:tc>
+        <w:tc>
+          <w:tcPr>
+            <w:tcW w:type="dxa" w:w="2880"/>
+          </w:tcPr>
+          <w:p>
+            <w:r>
+              <w:t>/unlock.html</w:t>
+            </w:r>
+          </w:p>
+        </w:tc>
+        <w:tc>
+          <w:tcPr>
+            <w:tcW w:type="dxa" w:w="2880"/>
+          </w:tcPr>
+          <w:p>
+            <w:r>
+              <w:t>一键写入 36 线索 + 全部旗标 + 100% 进度（覆盖现有存档）</w:t>
+            </w:r>
+          </w:p>
+        </w:tc>
+      </w:tr>
+    </w:tbl>
+    <w:p>
+      <w:r>
+        <w:t>本地预览：http://localhost:8090/；线上：https://que820.github.io/arg-rivervalley/。侧栏底部也有入口链接。</w:t>
+      </w:r>
+    </w:p>
+    <w:p>
+      <w:pPr>
+        <w:pStyle w:val="Heading2"/>
+      </w:pPr>
+      <w:r>
+        <w:t>七、卡点排错</w:t>
       </w:r>
     </w:p>
     <w:p>
@@ -3733,6 +3891,34 @@
       </w:r>
       <w:r>
         <w:t xml:space="preserve"> 是「几居」（特蕾莎线的涂黑）；「濯枝」在 Z-007 档案袋口登记条上，是明文，直接点击。</w:t>
+      </w:r>
+    </w:p>
+    <w:p>
+      <w:pPr>
+        <w:pStyle w:val="ListBullet"/>
+      </w:pPr>
+      <w:r>
+        <w:rPr>
+          <w:b/>
+        </w:rPr>
+        <w:t>聊天里打了关键词没反应？</w:t>
+      </w:r>
+      <w:r>
+        <w:t xml:space="preserve"> 现在已是包含式匹配，只要句子里带词条名或别名即可；若回的是「还太早」说明前置线索没拿齐（会显示「还差：…」提示）。</w:t>
+      </w:r>
+    </w:p>
+    <w:p>
+      <w:pPr>
+        <w:pStyle w:val="ListBullet"/>
+      </w:pPr>
+      <w:r>
+        <w:rPr>
+          <w:b/>
+        </w:rPr>
+        <w:t>问完线索侧栏没更新？</w:t>
+      </w:r>
+      <w:r>
+        <w:t xml:space="preserve"> 已修复为即时刷新；若在旧缓存页面，Ctrl+F5 强刷。</w:t>
       </w:r>
     </w:p>
     <w:sectPr>

</xml_diff>